<commit_message>
Dispositifs : partie « En CM2 » (mêmes ceintures qu'en CM1, approfondies) ; notes et outils mis à jour
Co-Authored-By: Claude Opus 5.5 <noreply@anthropic.com>
Claude-Session: https://claude.ai/code/session_017QuRdkcjT4oVgGuiybp2K2
</commit_message>
<xml_diff>
--- a/Documents explicatifs des dispositifs/Dispositif1_Grammaire_CM1_avec_jeux.docx
+++ b/Documents explicatifs des dispositifs/Dispositif1_Grammaire_CM1_avec_jeux.docx
@@ -2132,6 +2132,699 @@
       <w:r>
         <w:rPr/>
         <w:t xml:space="preserve">Ceintures produites selon ce parcours : G1 et G2 (y compris l’étape 3 complète).</w:t>
+      </w:r>
+    </w:p>
+    <w:p>
+      <w:pPr>
+        <w:pStyle w:val="Heading1"/>
+      </w:pPr>
+      <w:r>
+        <w:t xml:space="preserve">En CM2 : les mêmes ceintures, approfondies</w:t>
+      </w:r>
+    </w:p>
+    <w:p>
+      <w:pPr>
+        <w:pStyle w:val="BodyText"/>
+      </w:pPr>
+      <w:r>
+        <w:t xml:space="preserve">Depuis octobre 2026, chaque ceinture CM2 porte le même numéro, la même couleur et la même notion qu’en CM1. En classe à double niveau, l’observation et la trace écrite sont communes ; le CM2 va plus loin avec des écrans et des exercices en plus, et passe son propre test.</w:t>
+      </w:r>
+    </w:p>
+    <w:p>
+      <w:pPr>
+        <w:pStyle w:val="BodyText"/>
+        <w:numPr>
+          <w:ilvl w:val="0"/>
+          <w:numId w:val="1"/>
+        </w:numPr>
+        <w:spacing w:after="60"/>
+      </w:pPr>
+      <w:r>
+        <w:rPr>
+          <w:b/>
+          <w:bCs/>
+        </w:rPr>
+        <w:t xml:space="preserve">Trace écrite</w:t>
+      </w:r>
+      <w:r>
+        <w:t xml:space="preserve"> : la carte mentale est la même ; un encadré « En CM2, j’apprends aussi » la complète (page interactive et impression).</w:t>
+      </w:r>
+    </w:p>
+    <w:p>
+      <w:pPr>
+        <w:pStyle w:val="BodyText"/>
+        <w:numPr>
+          <w:ilvl w:val="0"/>
+          <w:numId w:val="1"/>
+        </w:numPr>
+        <w:spacing w:after="60"/>
+      </w:pPr>
+      <w:r>
+        <w:rPr>
+          <w:b/>
+          <w:bCs/>
+        </w:rPr>
+        <w:t xml:space="preserve">Page interactive</w:t>
+      </w:r>
+      <w:r>
+        <w:t xml:space="preserve"> : bouton « CM2 » du sommaire ; les écrans propres au CM2 portent l’étiquette « CM2 ».</w:t>
+      </w:r>
+    </w:p>
+    <w:p>
+      <w:pPr>
+        <w:pStyle w:val="BodyText"/>
+        <w:numPr>
+          <w:ilvl w:val="0"/>
+          <w:numId w:val="1"/>
+        </w:numPr>
+        <w:spacing w:after="60"/>
+      </w:pPr>
+      <w:r>
+        <w:rPr>
+          <w:b/>
+          <w:bCs/>
+        </w:rPr>
+        <w:t xml:space="preserve">Parcours</w:t>
+      </w:r>
+      <w:r>
+        <w:t xml:space="preserve"> : inchangé (Structure des ceintures) ; test ciblé A/B/C, réussite 6/6. Proposition : pour le CM2, 3 items sur le tronc commun et 3 items sur l’ajout CM2.</w:t>
+      </w:r>
+    </w:p>
+    <w:p>
+      <w:pPr>
+        <w:pStyle w:val="BodyText"/>
+        <w:numPr>
+          <w:ilvl w:val="0"/>
+          <w:numId w:val="1"/>
+        </w:numPr>
+        <w:spacing w:after="60"/>
+      </w:pPr>
+      <w:r>
+        <w:rPr>
+          <w:b/>
+          <w:bCs/>
+        </w:rPr>
+        <w:t xml:space="preserve">Cahier de progrès</w:t>
+      </w:r>
+      <w:r>
+        <w:t xml:space="preserve"> : parcours C des fiches CE2-CM1-CM2, renuméroté sur le CM1.</w:t>
+      </w:r>
+    </w:p>
+    <w:tbl>
+      <w:tblPr>
+        <w:tblW w:type="dxa" w:w="9600"/>
+        <w:tblBorders>
+          <w:top w:val="single" w:color="auto" w:sz="4"/>
+          <w:left w:val="single" w:color="auto" w:sz="4"/>
+          <w:bottom w:val="single" w:color="auto" w:sz="4"/>
+          <w:right w:val="single" w:color="auto" w:sz="4"/>
+          <w:insideH w:val="single" w:color="auto" w:sz="4"/>
+          <w:insideV w:val="single" w:color="auto" w:sz="4"/>
+        </w:tblBorders>
+        <w:tblCellMar>
+          <w:left w:w="80" w:type="dxa"/>
+          <w:right w:w="80" w:type="dxa"/>
+        </w:tblCellMar>
+      </w:tblPr>
+      <w:tblGrid>
+        <w:gridCol w:w="615"/>
+        <w:gridCol w:w="969"/>
+        <w:gridCol w:w="3080"/>
+        <w:gridCol w:w="4016"/>
+        <w:gridCol w:w="918"/>
+      </w:tblGrid>
+      <w:tr>
+        <w:trPr>
+          <w:tblHeader/>
+        </w:trPr>
+        <w:tc>
+          <w:tcPr>
+            <w:tcW w:type="dxa" w:w="615"/>
+            <w:shd w:fill="D9E2F3" w:val="clear"/>
+          </w:tcPr>
+          <w:p>
+            <w:pPr>
+              <w:spacing w:before="20" w:after="20"/>
+            </w:pPr>
+            <w:r>
+              <w:rPr>
+                <w:b/>
+                <w:bCs/>
+              </w:rPr>
+              <w:t xml:space="preserve">N°</w:t>
+            </w:r>
+          </w:p>
+        </w:tc>
+        <w:tc>
+          <w:tcPr>
+            <w:tcW w:type="dxa" w:w="969"/>
+            <w:shd w:fill="D9E2F3" w:val="clear"/>
+          </w:tcPr>
+          <w:p>
+            <w:pPr>
+              <w:spacing w:before="20" w:after="20"/>
+            </w:pPr>
+            <w:r>
+              <w:rPr>
+                <w:b/>
+                <w:bCs/>
+              </w:rPr>
+              <w:t xml:space="preserve">Couleur</w:t>
+            </w:r>
+          </w:p>
+        </w:tc>
+        <w:tc>
+          <w:tcPr>
+            <w:tcW w:type="dxa" w:w="3080"/>
+            <w:shd w:fill="D9E2F3" w:val="clear"/>
+          </w:tcPr>
+          <w:p>
+            <w:pPr>
+              <w:spacing w:before="20" w:after="20"/>
+            </w:pPr>
+            <w:r>
+              <w:rPr>
+                <w:b/>
+                <w:bCs/>
+              </w:rPr>
+              <w:t xml:space="preserve">Tronc commun (CM1)</w:t>
+            </w:r>
+          </w:p>
+        </w:tc>
+        <w:tc>
+          <w:tcPr>
+            <w:tcW w:type="dxa" w:w="4016"/>
+            <w:shd w:fill="D9E2F3" w:val="clear"/>
+          </w:tcPr>
+          <w:p>
+            <w:pPr>
+              <w:spacing w:before="20" w:after="20"/>
+            </w:pPr>
+            <w:r>
+              <w:rPr>
+                <w:b/>
+                <w:bCs/>
+              </w:rPr>
+              <w:t xml:space="preserve">En plus en CM2</w:t>
+            </w:r>
+          </w:p>
+        </w:tc>
+        <w:tc>
+          <w:tcPr>
+            <w:tcW w:type="dxa" w:w="918"/>
+            <w:shd w:fill="D9E2F3" w:val="clear"/>
+          </w:tcPr>
+          <w:p>
+            <w:pPr>
+              <w:spacing w:before="20" w:after="20"/>
+            </w:pPr>
+            <w:r>
+              <w:rPr>
+                <w:b/>
+                <w:bCs/>
+              </w:rPr>
+              <w:t xml:space="preserve">Période</w:t>
+            </w:r>
+          </w:p>
+        </w:tc>
+      </w:tr>
+      <w:tr>
+        <w:tc>
+          <w:tcPr>
+            <w:tcW w:type="dxa" w:w="615"/>
+          </w:tcPr>
+          <w:p>
+            <w:pPr>
+              <w:spacing w:before="20" w:after="20"/>
+            </w:pPr>
+            <w:r>
+              <w:t xml:space="preserve">G1</w:t>
+            </w:r>
+          </w:p>
+        </w:tc>
+        <w:tc>
+          <w:tcPr>
+            <w:tcW w:type="dxa" w:w="969"/>
+          </w:tcPr>
+          <w:p>
+            <w:pPr>
+              <w:spacing w:before="20" w:after="20"/>
+            </w:pPr>
+            <w:r>
+              <w:t xml:space="preserve">Blanche</w:t>
+            </w:r>
+          </w:p>
+        </w:tc>
+        <w:tc>
+          <w:tcPr>
+            <w:tcW w:type="dxa" w:w="3080"/>
+          </w:tcPr>
+          <w:p>
+            <w:pPr>
+              <w:spacing w:before="20" w:after="20"/>
+            </w:pPr>
+            <w:r>
+              <w:t xml:space="preserve">Sujet et verbe ; sujet composé, après le verbe ; verbes d’état</w:t>
+            </w:r>
+          </w:p>
+        </w:tc>
+        <w:tc>
+          <w:tcPr>
+            <w:tcW w:type="dxa" w:w="4016"/>
+          </w:tcPr>
+          <w:p>
+            <w:pPr>
+              <w:spacing w:before="20" w:after="20"/>
+            </w:pPr>
+            <w:r>
+              <w:t xml:space="preserve">Le sujet inversé, prouvé avec « c’est… qui »</w:t>
+            </w:r>
+          </w:p>
+        </w:tc>
+        <w:tc>
+          <w:tcPr>
+            <w:tcW w:type="dxa" w:w="918"/>
+          </w:tcPr>
+          <w:p>
+            <w:pPr>
+              <w:spacing w:before="20" w:after="20"/>
+            </w:pPr>
+            <w:r>
+              <w:t xml:space="preserve">P1</w:t>
+            </w:r>
+          </w:p>
+        </w:tc>
+      </w:tr>
+      <w:tr>
+        <w:tc>
+          <w:tcPr>
+            <w:tcW w:type="dxa" w:w="615"/>
+          </w:tcPr>
+          <w:p>
+            <w:pPr>
+              <w:spacing w:before="20" w:after="20"/>
+            </w:pPr>
+            <w:r>
+              <w:t xml:space="preserve">G2</w:t>
+            </w:r>
+          </w:p>
+        </w:tc>
+        <w:tc>
+          <w:tcPr>
+            <w:tcW w:type="dxa" w:w="969"/>
+          </w:tcPr>
+          <w:p>
+            <w:pPr>
+              <w:spacing w:before="20" w:after="20"/>
+            </w:pPr>
+            <w:r>
+              <w:t xml:space="preserve">Rose</w:t>
+            </w:r>
+          </w:p>
+        </w:tc>
+        <w:tc>
+          <w:tcPr>
+            <w:tcW w:type="dxa" w:w="3080"/>
+          </w:tcPr>
+          <w:p>
+            <w:pPr>
+              <w:spacing w:before="20" w:after="20"/>
+            </w:pPr>
+            <w:r>
+              <w:t xml:space="preserve">Types et formes de phrase</w:t>
+            </w:r>
+          </w:p>
+        </w:tc>
+        <w:tc>
+          <w:tcPr>
+            <w:tcW w:type="dxa" w:w="4016"/>
+          </w:tcPr>
+          <w:p>
+            <w:pPr>
+              <w:spacing w:before="20" w:after="20"/>
+            </w:pPr>
+            <w:r>
+              <w:t xml:space="preserve">Phrase simple ou complexe (je compte les verbes conjugués) ; les mots qui relient</w:t>
+            </w:r>
+          </w:p>
+        </w:tc>
+        <w:tc>
+          <w:tcPr>
+            <w:tcW w:type="dxa" w:w="918"/>
+          </w:tcPr>
+          <w:p>
+            <w:pPr>
+              <w:spacing w:before="20" w:after="20"/>
+            </w:pPr>
+            <w:r>
+              <w:t xml:space="preserve">P1</w:t>
+            </w:r>
+          </w:p>
+        </w:tc>
+      </w:tr>
+      <w:tr>
+        <w:tc>
+          <w:tcPr>
+            <w:tcW w:type="dxa" w:w="615"/>
+          </w:tcPr>
+          <w:p>
+            <w:pPr>
+              <w:spacing w:before="20" w:after="20"/>
+            </w:pPr>
+            <w:r>
+              <w:t xml:space="preserve">G3</w:t>
+            </w:r>
+          </w:p>
+        </w:tc>
+        <w:tc>
+          <w:tcPr>
+            <w:tcW w:type="dxa" w:w="969"/>
+          </w:tcPr>
+          <w:p>
+            <w:pPr>
+              <w:spacing w:before="20" w:after="20"/>
+            </w:pPr>
+            <w:r>
+              <w:t xml:space="preserve">Jaune</w:t>
+            </w:r>
+          </w:p>
+        </w:tc>
+        <w:tc>
+          <w:tcPr>
+            <w:tcW w:type="dxa" w:w="3080"/>
+          </w:tcPr>
+          <w:p>
+            <w:pPr>
+              <w:spacing w:before="20" w:after="20"/>
+            </w:pPr>
+            <w:r>
+              <w:t xml:space="preserve">Groupe nominal ; accords ; féminins qui changent ; pluriels en -x et -aux</w:t>
+            </w:r>
+          </w:p>
+        </w:tc>
+        <w:tc>
+          <w:tcPr>
+            <w:tcW w:type="dxa" w:w="4016"/>
+          </w:tcPr>
+          <w:p>
+            <w:pPr>
+              <w:spacing w:before="20" w:after="20"/>
+            </w:pPr>
+            <w:r>
+              <w:t xml:space="preserve">Le complément du nom ; épithète ou attribut du sujet</w:t>
+            </w:r>
+          </w:p>
+        </w:tc>
+        <w:tc>
+          <w:tcPr>
+            <w:tcW w:type="dxa" w:w="918"/>
+          </w:tcPr>
+          <w:p>
+            <w:pPr>
+              <w:spacing w:before="20" w:after="20"/>
+            </w:pPr>
+            <w:r>
+              <w:t xml:space="preserve">P2</w:t>
+            </w:r>
+          </w:p>
+        </w:tc>
+      </w:tr>
+      <w:tr>
+        <w:tc>
+          <w:tcPr>
+            <w:tcW w:type="dxa" w:w="615"/>
+          </w:tcPr>
+          <w:p>
+            <w:pPr>
+              <w:spacing w:before="20" w:after="20"/>
+            </w:pPr>
+            <w:r>
+              <w:t xml:space="preserve">G4</w:t>
+            </w:r>
+          </w:p>
+        </w:tc>
+        <w:tc>
+          <w:tcPr>
+            <w:tcW w:type="dxa" w:w="969"/>
+          </w:tcPr>
+          <w:p>
+            <w:pPr>
+              <w:spacing w:before="20" w:after="20"/>
+            </w:pPr>
+            <w:r>
+              <w:t xml:space="preserve">Orange</w:t>
+            </w:r>
+          </w:p>
+        </w:tc>
+        <w:tc>
+          <w:tcPr>
+            <w:tcW w:type="dxa" w:w="3080"/>
+          </w:tcPr>
+          <w:p>
+            <w:pPr>
+              <w:spacing w:before="20" w:after="20"/>
+            </w:pPr>
+            <w:r>
+              <w:t xml:space="preserve">Classes de mots ; verbe ou nom ; variable ou invariable</w:t>
+            </w:r>
+          </w:p>
+        </w:tc>
+        <w:tc>
+          <w:tcPr>
+            <w:tcW w:type="dxa" w:w="4016"/>
+          </w:tcPr>
+          <w:p>
+            <w:pPr>
+              <w:spacing w:before="20" w:after="20"/>
+            </w:pPr>
+            <w:r>
+              <w:t xml:space="preserve">Les prépositions ; les conjonctions de subordination ; le, la, les : déterminant ou pronom</w:t>
+            </w:r>
+          </w:p>
+        </w:tc>
+        <w:tc>
+          <w:tcPr>
+            <w:tcW w:type="dxa" w:w="918"/>
+          </w:tcPr>
+          <w:p>
+            <w:pPr>
+              <w:spacing w:before="20" w:after="20"/>
+            </w:pPr>
+            <w:r>
+              <w:t xml:space="preserve">P2</w:t>
+            </w:r>
+          </w:p>
+        </w:tc>
+      </w:tr>
+      <w:tr>
+        <w:tc>
+          <w:tcPr>
+            <w:tcW w:type="dxa" w:w="615"/>
+          </w:tcPr>
+          <w:p>
+            <w:pPr>
+              <w:spacing w:before="20" w:after="20"/>
+            </w:pPr>
+            <w:r>
+              <w:t xml:space="preserve">G5</w:t>
+            </w:r>
+          </w:p>
+        </w:tc>
+        <w:tc>
+          <w:tcPr>
+            <w:tcW w:type="dxa" w:w="969"/>
+          </w:tcPr>
+          <w:p>
+            <w:pPr>
+              <w:spacing w:before="20" w:after="20"/>
+            </w:pPr>
+            <w:r>
+              <w:t xml:space="preserve">Verte</w:t>
+            </w:r>
+          </w:p>
+        </w:tc>
+        <w:tc>
+          <w:tcPr>
+            <w:tcW w:type="dxa" w:w="3080"/>
+          </w:tcPr>
+          <w:p>
+            <w:pPr>
+              <w:spacing w:before="20" w:after="20"/>
+            </w:pPr>
+            <w:r>
+              <w:t xml:space="preserve">Accord sujet-verbe ; pièges ; 2e groupe</w:t>
+            </w:r>
+          </w:p>
+        </w:tc>
+        <w:tc>
+          <w:tcPr>
+            <w:tcW w:type="dxa" w:w="4016"/>
+          </w:tcPr>
+          <w:p>
+            <w:pPr>
+              <w:spacing w:before="20" w:after="20"/>
+            </w:pPr>
+            <w:r>
+              <w:t xml:space="preserve">Le sujet inversé dans les questions ; l’accord de l’attribut du sujet</w:t>
+            </w:r>
+          </w:p>
+        </w:tc>
+        <w:tc>
+          <w:tcPr>
+            <w:tcW w:type="dxa" w:w="918"/>
+          </w:tcPr>
+          <w:p>
+            <w:pPr>
+              <w:spacing w:before="20" w:after="20"/>
+            </w:pPr>
+            <w:r>
+              <w:t xml:space="preserve">P3</w:t>
+            </w:r>
+          </w:p>
+        </w:tc>
+      </w:tr>
+      <w:tr>
+        <w:tc>
+          <w:tcPr>
+            <w:tcW w:type="dxa" w:w="615"/>
+          </w:tcPr>
+          <w:p>
+            <w:pPr>
+              <w:spacing w:before="20" w:after="20"/>
+            </w:pPr>
+            <w:r>
+              <w:t xml:space="preserve">G6</w:t>
+            </w:r>
+          </w:p>
+        </w:tc>
+        <w:tc>
+          <w:tcPr>
+            <w:tcW w:type="dxa" w:w="969"/>
+          </w:tcPr>
+          <w:p>
+            <w:pPr>
+              <w:spacing w:before="20" w:after="20"/>
+            </w:pPr>
+            <w:r>
+              <w:t xml:space="preserve">Bleue</w:t>
+            </w:r>
+          </w:p>
+        </w:tc>
+        <w:tc>
+          <w:tcPr>
+            <w:tcW w:type="dxa" w:w="3080"/>
+          </w:tcPr>
+          <w:p>
+            <w:pPr>
+              <w:spacing w:before="20" w:after="20"/>
+            </w:pPr>
+            <w:r>
+              <w:t xml:space="preserve">Compléments d’objet et circonstanciels ; supprimer, déplacer</w:t>
+            </w:r>
+          </w:p>
+        </w:tc>
+        <w:tc>
+          <w:tcPr>
+            <w:tcW w:type="dxa" w:w="4016"/>
+          </w:tcPr>
+          <w:p>
+            <w:pPr>
+              <w:spacing w:before="20" w:after="20"/>
+            </w:pPr>
+            <w:r>
+              <w:t xml:space="preserve">La préposition du COI ; compléments circonstanciels de temps, de lieu, de cause ; attribut ou complément d’objet</w:t>
+            </w:r>
+          </w:p>
+        </w:tc>
+        <w:tc>
+          <w:tcPr>
+            <w:tcW w:type="dxa" w:w="918"/>
+          </w:tcPr>
+          <w:p>
+            <w:pPr>
+              <w:spacing w:before="20" w:after="20"/>
+            </w:pPr>
+            <w:r>
+              <w:t xml:space="preserve">P3</w:t>
+            </w:r>
+          </w:p>
+        </w:tc>
+      </w:tr>
+      <w:tr>
+        <w:tc>
+          <w:tcPr>
+            <w:tcW w:type="dxa" w:w="615"/>
+          </w:tcPr>
+          <w:p>
+            <w:pPr>
+              <w:spacing w:before="20" w:after="20"/>
+            </w:pPr>
+            <w:r>
+              <w:t xml:space="preserve">G7</w:t>
+            </w:r>
+          </w:p>
+        </w:tc>
+        <w:tc>
+          <w:tcPr>
+            <w:tcW w:type="dxa" w:w="969"/>
+          </w:tcPr>
+          <w:p>
+            <w:pPr>
+              <w:spacing w:before="20" w:after="20"/>
+            </w:pPr>
+            <w:r>
+              <w:t xml:space="preserve">Violette</w:t>
+            </w:r>
+          </w:p>
+        </w:tc>
+        <w:tc>
+          <w:tcPr>
+            <w:tcW w:type="dxa" w:w="3080"/>
+          </w:tcPr>
+          <w:p>
+            <w:pPr>
+              <w:spacing w:before="20" w:after="20"/>
+            </w:pPr>
+            <w:r>
+              <w:t xml:space="preserve">Chaîne des accords : GN, sujet-verbe, participe passé avec être</w:t>
+            </w:r>
+          </w:p>
+        </w:tc>
+        <w:tc>
+          <w:tcPr>
+            <w:tcW w:type="dxa" w:w="4016"/>
+          </w:tcPr>
+          <w:p>
+            <w:pPr>
+              <w:spacing w:before="20" w:after="20"/>
+            </w:pPr>
+            <w:r>
+              <w:t xml:space="preserve">L’attribut du sujet dans la chaîne</w:t>
+            </w:r>
+          </w:p>
+        </w:tc>
+        <w:tc>
+          <w:tcPr>
+            <w:tcW w:type="dxa" w:w="918"/>
+          </w:tcPr>
+          <w:p>
+            <w:pPr>
+              <w:spacing w:before="20" w:after="20"/>
+            </w:pPr>
+            <w:r>
+              <w:t xml:space="preserve">P4</w:t>
+            </w:r>
+          </w:p>
+        </w:tc>
+      </w:tr>
+    </w:tbl>
+    <w:p/>
+    <w:p>
+      <w:pPr>
+        <w:pStyle w:val="BodyText"/>
+      </w:pPr>
+      <w:r>
+        <w:t xml:space="preserve">Programme 2025 (CM2) couvert ainsi : sujet inversé, phrase simple et phrase complexe, complément du nom, épithète et attribut, prépositions, conjonctions de subordination, pronoms compléments, COD/COI, compléments circonstanciels de temps, de lieu et de cause. La limite notée au §1 (phrase simple/phrase complexe hors CM1) est levée pour le CM2 : elle est traitée en G2.</w:t>
       </w:r>
     </w:p>
     <w:sectPr>

</xml_diff>

<commit_message>
CE2 : leçons alignées sur le CM1 (version simplifiée), C6-C7 verbes irréguliers et O7 sons/accents, parcours A des cahiers, partie « En CE2 » des dispositifs, vue des trois niveaux
Co-Authored-By: Claude Opus 5.5 <noreply@anthropic.com>
Claude-Session: https://claude.ai/code/session_017QuRdkcjT4oVgGuiybp2K2
</commit_message>
<xml_diff>
--- a/Documents explicatifs des dispositifs/Dispositif1_Grammaire_CM1_avec_jeux.docx
+++ b/Documents explicatifs des dispositifs/Dispositif1_Grammaire_CM1_avec_jeux.docx
@@ -2825,6 +2825,699 @@
       </w:pPr>
       <w:r>
         <w:t xml:space="preserve">Programme 2025 (CM2) couvert ainsi : sujet inversé, phrase simple et phrase complexe, complément du nom, épithète et attribut, prépositions, conjonctions de subordination, pronoms compléments, COD/COI, compléments circonstanciels de temps, de lieu et de cause. La limite notée au §1 (phrase simple/phrase complexe hors CM1) est levée pour le CM2 : elle est traitée en G2.</w:t>
+      </w:r>
+    </w:p>
+    <w:p>
+      <w:pPr>
+        <w:pStyle w:val="Heading1"/>
+      </w:pPr>
+      <w:r>
+        <w:t xml:space="preserve">En CE2 : les mêmes ceintures, en plus simple</w:t>
+      </w:r>
+    </w:p>
+    <w:p>
+      <w:pPr>
+        <w:pStyle w:val="BodyText"/>
+      </w:pPr>
+      <w:r>
+        <w:t xml:space="preserve">Depuis octobre 2026, chaque ceinture CE2 porte le même numéro, la même couleur et la même notion qu’en CM1 et en CM2, dans une version plus simple, conforme au programme de français du cycle 2 (2025). En classe à plusieurs niveaux, l’observation et la trace écrite sont communes ; le CE2 s’arrête au tronc commun.</w:t>
+      </w:r>
+    </w:p>
+    <w:p>
+      <w:pPr>
+        <w:pStyle w:val="BodyText"/>
+        <w:numPr>
+          <w:ilvl w:val="0"/>
+          <w:numId w:val="1"/>
+        </w:numPr>
+        <w:spacing w:after="60"/>
+      </w:pPr>
+      <w:r>
+        <w:rPr>
+          <w:b/>
+          <w:bCs/>
+        </w:rPr>
+        <w:t xml:space="preserve">Trace écrite</w:t>
+      </w:r>
+      <w:r>
+        <w:t xml:space="preserve"> : la carte mentale est la même ; un encadré « Au CE2, je retiens » dit ce que le CE2 doit savoir (page interactive et impression).</w:t>
+      </w:r>
+    </w:p>
+    <w:p>
+      <w:pPr>
+        <w:pStyle w:val="BodyText"/>
+        <w:numPr>
+          <w:ilvl w:val="0"/>
+          <w:numId w:val="1"/>
+        </w:numPr>
+        <w:spacing w:after="60"/>
+      </w:pPr>
+      <w:r>
+        <w:rPr>
+          <w:b/>
+          <w:bCs/>
+        </w:rPr>
+        <w:t xml:space="preserve">Page interactive</w:t>
+      </w:r>
+      <w:r>
+        <w:t xml:space="preserve"> : bouton « CE2 » du sommaire ; les écrans trop difficiles sont retirés, les écrans propres au CE2 portent l’étiquette « CE2 ».</w:t>
+      </w:r>
+    </w:p>
+    <w:p>
+      <w:pPr>
+        <w:pStyle w:val="BodyText"/>
+        <w:numPr>
+          <w:ilvl w:val="0"/>
+          <w:numId w:val="1"/>
+        </w:numPr>
+        <w:spacing w:after="60"/>
+      </w:pPr>
+      <w:r>
+        <w:rPr>
+          <w:b/>
+          <w:bCs/>
+        </w:rPr>
+        <w:t xml:space="preserve">Parcours</w:t>
+      </w:r>
+      <w:r>
+        <w:t xml:space="preserve"> : inchangé (Structure des ceintures) ; test ciblé A/B/C, 6 items sur le contenu CE2, réussite 6/6.</w:t>
+      </w:r>
+    </w:p>
+    <w:p>
+      <w:pPr>
+        <w:pStyle w:val="BodyText"/>
+        <w:numPr>
+          <w:ilvl w:val="0"/>
+          <w:numId w:val="1"/>
+        </w:numPr>
+        <w:spacing w:after="60"/>
+      </w:pPr>
+      <w:r>
+        <w:rPr>
+          <w:b/>
+          <w:bCs/>
+        </w:rPr>
+        <w:t xml:space="preserve">Cahier de progrès</w:t>
+      </w:r>
+      <w:r>
+        <w:t xml:space="preserve"> : parcours A des fiches CE2-CM1-CM2, renuméroté sur le CM1.</w:t>
+      </w:r>
+    </w:p>
+    <w:tbl>
+      <w:tblPr>
+        <w:tblW w:type="dxa" w:w="9600"/>
+        <w:tblBorders>
+          <w:top w:val="single" w:color="auto" w:sz="4"/>
+          <w:left w:val="single" w:color="auto" w:sz="4"/>
+          <w:bottom w:val="single" w:color="auto" w:sz="4"/>
+          <w:right w:val="single" w:color="auto" w:sz="4"/>
+          <w:insideH w:val="single" w:color="auto" w:sz="4"/>
+          <w:insideV w:val="single" w:color="auto" w:sz="4"/>
+        </w:tblBorders>
+        <w:tblCellMar>
+          <w:left w:w="80" w:type="dxa"/>
+          <w:right w:w="80" w:type="dxa"/>
+        </w:tblCellMar>
+      </w:tblPr>
+      <w:tblGrid>
+        <w:gridCol w:w="623"/>
+        <w:gridCol w:w="982"/>
+        <w:gridCol w:w="3838"/>
+        <w:gridCol w:w="3224"/>
+        <w:gridCol w:w="930"/>
+      </w:tblGrid>
+      <w:tr>
+        <w:trPr>
+          <w:tblHeader/>
+        </w:trPr>
+        <w:tc>
+          <w:tcPr>
+            <w:tcW w:type="dxa" w:w="623"/>
+            <w:shd w:fill="D9E2F3" w:val="clear"/>
+          </w:tcPr>
+          <w:p>
+            <w:pPr>
+              <w:spacing w:before="20" w:after="20"/>
+            </w:pPr>
+            <w:r>
+              <w:rPr>
+                <w:b/>
+                <w:bCs/>
+              </w:rPr>
+              <w:t xml:space="preserve">N°</w:t>
+            </w:r>
+          </w:p>
+        </w:tc>
+        <w:tc>
+          <w:tcPr>
+            <w:tcW w:type="dxa" w:w="982"/>
+            <w:shd w:fill="D9E2F3" w:val="clear"/>
+          </w:tcPr>
+          <w:p>
+            <w:pPr>
+              <w:spacing w:before="20" w:after="20"/>
+            </w:pPr>
+            <w:r>
+              <w:rPr>
+                <w:b/>
+                <w:bCs/>
+              </w:rPr>
+              <w:t xml:space="preserve">Couleur</w:t>
+            </w:r>
+          </w:p>
+        </w:tc>
+        <w:tc>
+          <w:tcPr>
+            <w:tcW w:type="dxa" w:w="3838"/>
+            <w:shd w:fill="D9E2F3" w:val="clear"/>
+          </w:tcPr>
+          <w:p>
+            <w:pPr>
+              <w:spacing w:before="20" w:after="20"/>
+            </w:pPr>
+            <w:r>
+              <w:rPr>
+                <w:b/>
+                <w:bCs/>
+              </w:rPr>
+              <w:t xml:space="preserve">Au CE2</w:t>
+            </w:r>
+          </w:p>
+        </w:tc>
+        <w:tc>
+          <w:tcPr>
+            <w:tcW w:type="dxa" w:w="3224"/>
+            <w:shd w:fill="D9E2F3" w:val="clear"/>
+          </w:tcPr>
+          <w:p>
+            <w:pPr>
+              <w:spacing w:before="20" w:after="20"/>
+            </w:pPr>
+            <w:r>
+              <w:rPr>
+                <w:b/>
+                <w:bCs/>
+              </w:rPr>
+              <w:t xml:space="preserve">Ce que le CM1 ajoute</w:t>
+            </w:r>
+          </w:p>
+        </w:tc>
+        <w:tc>
+          <w:tcPr>
+            <w:tcW w:type="dxa" w:w="930"/>
+            <w:shd w:fill="D9E2F3" w:val="clear"/>
+          </w:tcPr>
+          <w:p>
+            <w:pPr>
+              <w:spacing w:before="20" w:after="20"/>
+            </w:pPr>
+            <w:r>
+              <w:rPr>
+                <w:b/>
+                <w:bCs/>
+              </w:rPr>
+              <w:t xml:space="preserve">Période</w:t>
+            </w:r>
+          </w:p>
+        </w:tc>
+      </w:tr>
+      <w:tr>
+        <w:tc>
+          <w:tcPr>
+            <w:tcW w:type="dxa" w:w="623"/>
+          </w:tcPr>
+          <w:p>
+            <w:pPr>
+              <w:spacing w:before="20" w:after="20"/>
+            </w:pPr>
+            <w:r>
+              <w:t xml:space="preserve">G1</w:t>
+            </w:r>
+          </w:p>
+        </w:tc>
+        <w:tc>
+          <w:tcPr>
+            <w:tcW w:type="dxa" w:w="982"/>
+          </w:tcPr>
+          <w:p>
+            <w:pPr>
+              <w:spacing w:before="20" w:after="20"/>
+            </w:pPr>
+            <w:r>
+              <w:t xml:space="preserve">Blanche</w:t>
+            </w:r>
+          </w:p>
+        </w:tc>
+        <w:tc>
+          <w:tcPr>
+            <w:tcW w:type="dxa" w:w="3838"/>
+          </w:tcPr>
+          <w:p>
+            <w:pPr>
+              <w:spacing w:before="20" w:after="20"/>
+            </w:pPr>
+            <w:r>
+              <w:t xml:space="preserve">Sujet et verbe ; « qui est-ce qui ? » ; remplacer le sujet par un pronom</w:t>
+            </w:r>
+          </w:p>
+        </w:tc>
+        <w:tc>
+          <w:tcPr>
+            <w:tcW w:type="dxa" w:w="3224"/>
+          </w:tcPr>
+          <w:p>
+            <w:pPr>
+              <w:spacing w:before="20" w:after="20"/>
+            </w:pPr>
+            <w:r>
+              <w:t xml:space="preserve">Sujet composé, sujet après le verbe, verbes d’état</w:t>
+            </w:r>
+          </w:p>
+        </w:tc>
+        <w:tc>
+          <w:tcPr>
+            <w:tcW w:type="dxa" w:w="930"/>
+          </w:tcPr>
+          <w:p>
+            <w:pPr>
+              <w:spacing w:before="20" w:after="20"/>
+            </w:pPr>
+            <w:r>
+              <w:t xml:space="preserve">P1</w:t>
+            </w:r>
+          </w:p>
+        </w:tc>
+      </w:tr>
+      <w:tr>
+        <w:tc>
+          <w:tcPr>
+            <w:tcW w:type="dxa" w:w="623"/>
+          </w:tcPr>
+          <w:p>
+            <w:pPr>
+              <w:spacing w:before="20" w:after="20"/>
+            </w:pPr>
+            <w:r>
+              <w:t xml:space="preserve">G2</w:t>
+            </w:r>
+          </w:p>
+        </w:tc>
+        <w:tc>
+          <w:tcPr>
+            <w:tcW w:type="dxa" w:w="982"/>
+          </w:tcPr>
+          <w:p>
+            <w:pPr>
+              <w:spacing w:before="20" w:after="20"/>
+            </w:pPr>
+            <w:r>
+              <w:t xml:space="preserve">Rose</w:t>
+            </w:r>
+          </w:p>
+        </w:tc>
+        <w:tc>
+          <w:tcPr>
+            <w:tcW w:type="dxa" w:w="3838"/>
+          </w:tcPr>
+          <w:p>
+            <w:pPr>
+              <w:spacing w:before="20" w:after="20"/>
+            </w:pPr>
+            <w:r>
+              <w:t xml:space="preserve">3 types de phrase ; formes négative et exclamative ; ponctuation ; guillemets du dialogue</w:t>
+            </w:r>
+          </w:p>
+        </w:tc>
+        <w:tc>
+          <w:tcPr>
+            <w:tcW w:type="dxa" w:w="3224"/>
+          </w:tcPr>
+          <w:p>
+            <w:pPr>
+              <w:spacing w:before="20" w:after="20"/>
+            </w:pPr>
+            <w:r>
+              <w:t xml:space="preserve">3 façons d’interroger ; ne… jamais, ne… plus ; élision</w:t>
+            </w:r>
+          </w:p>
+        </w:tc>
+        <w:tc>
+          <w:tcPr>
+            <w:tcW w:type="dxa" w:w="930"/>
+          </w:tcPr>
+          <w:p>
+            <w:pPr>
+              <w:spacing w:before="20" w:after="20"/>
+            </w:pPr>
+            <w:r>
+              <w:t xml:space="preserve">P1</w:t>
+            </w:r>
+          </w:p>
+        </w:tc>
+      </w:tr>
+      <w:tr>
+        <w:tc>
+          <w:tcPr>
+            <w:tcW w:type="dxa" w:w="623"/>
+          </w:tcPr>
+          <w:p>
+            <w:pPr>
+              <w:spacing w:before="20" w:after="20"/>
+            </w:pPr>
+            <w:r>
+              <w:t xml:space="preserve">G3</w:t>
+            </w:r>
+          </w:p>
+        </w:tc>
+        <w:tc>
+          <w:tcPr>
+            <w:tcW w:type="dxa" w:w="982"/>
+          </w:tcPr>
+          <w:p>
+            <w:pPr>
+              <w:spacing w:before="20" w:after="20"/>
+            </w:pPr>
+            <w:r>
+              <w:t xml:space="preserve">Jaune</w:t>
+            </w:r>
+          </w:p>
+        </w:tc>
+        <w:tc>
+          <w:tcPr>
+            <w:tcW w:type="dxa" w:w="3838"/>
+          </w:tcPr>
+          <w:p>
+            <w:pPr>
+              <w:spacing w:before="20" w:after="20"/>
+            </w:pPr>
+            <w:r>
+              <w:t xml:space="preserve">Groupe nominal ; accords en genre et en nombre ; pluriels en -x et -aux ; féminins qui s’entendent</w:t>
+            </w:r>
+          </w:p>
+        </w:tc>
+        <w:tc>
+          <w:tcPr>
+            <w:tcW w:type="dxa" w:w="3224"/>
+          </w:tcPr>
+          <w:p>
+            <w:pPr>
+              <w:spacing w:before="20" w:after="20"/>
+            </w:pPr>
+            <w:r>
+              <w:t xml:space="preserve">—</w:t>
+            </w:r>
+          </w:p>
+        </w:tc>
+        <w:tc>
+          <w:tcPr>
+            <w:tcW w:type="dxa" w:w="930"/>
+          </w:tcPr>
+          <w:p>
+            <w:pPr>
+              <w:spacing w:before="20" w:after="20"/>
+            </w:pPr>
+            <w:r>
+              <w:t xml:space="preserve">P2</w:t>
+            </w:r>
+          </w:p>
+        </w:tc>
+      </w:tr>
+      <w:tr>
+        <w:tc>
+          <w:tcPr>
+            <w:tcW w:type="dxa" w:w="623"/>
+          </w:tcPr>
+          <w:p>
+            <w:pPr>
+              <w:spacing w:before="20" w:after="20"/>
+            </w:pPr>
+            <w:r>
+              <w:t xml:space="preserve">G4</w:t>
+            </w:r>
+          </w:p>
+        </w:tc>
+        <w:tc>
+          <w:tcPr>
+            <w:tcW w:type="dxa" w:w="982"/>
+          </w:tcPr>
+          <w:p>
+            <w:pPr>
+              <w:spacing w:before="20" w:after="20"/>
+            </w:pPr>
+            <w:r>
+              <w:t xml:space="preserve">Orange</w:t>
+            </w:r>
+          </w:p>
+        </w:tc>
+        <w:tc>
+          <w:tcPr>
+            <w:tcW w:type="dxa" w:w="3838"/>
+          </w:tcPr>
+          <w:p>
+            <w:pPr>
+              <w:spacing w:before="20" w:after="20"/>
+            </w:pPr>
+            <w:r>
+              <w:t xml:space="preserve">Nom commun et nom propre, déterminant, adjectif, verbe, pronom sujet, adverbe ; variable ou invariable</w:t>
+            </w:r>
+          </w:p>
+        </w:tc>
+        <w:tc>
+          <w:tcPr>
+            <w:tcW w:type="dxa" w:w="3224"/>
+          </w:tcPr>
+          <w:p>
+            <w:pPr>
+              <w:spacing w:before="20" w:after="20"/>
+            </w:pPr>
+            <w:r>
+              <w:t xml:space="preserve">Possessifs et démonstratifs, pronoms compléments, conjonctions ; verbe ou nom</w:t>
+            </w:r>
+          </w:p>
+        </w:tc>
+        <w:tc>
+          <w:tcPr>
+            <w:tcW w:type="dxa" w:w="930"/>
+          </w:tcPr>
+          <w:p>
+            <w:pPr>
+              <w:spacing w:before="20" w:after="20"/>
+            </w:pPr>
+            <w:r>
+              <w:t xml:space="preserve">P2</w:t>
+            </w:r>
+          </w:p>
+        </w:tc>
+      </w:tr>
+      <w:tr>
+        <w:tc>
+          <w:tcPr>
+            <w:tcW w:type="dxa" w:w="623"/>
+          </w:tcPr>
+          <w:p>
+            <w:pPr>
+              <w:spacing w:before="20" w:after="20"/>
+            </w:pPr>
+            <w:r>
+              <w:t xml:space="preserve">G5</w:t>
+            </w:r>
+          </w:p>
+        </w:tc>
+        <w:tc>
+          <w:tcPr>
+            <w:tcW w:type="dxa" w:w="982"/>
+          </w:tcPr>
+          <w:p>
+            <w:pPr>
+              <w:spacing w:before="20" w:after="20"/>
+            </w:pPr>
+            <w:r>
+              <w:t xml:space="preserve">Verte</w:t>
+            </w:r>
+          </w:p>
+        </w:tc>
+        <w:tc>
+          <w:tcPr>
+            <w:tcW w:type="dxa" w:w="3838"/>
+          </w:tcPr>
+          <w:p>
+            <w:pPr>
+              <w:spacing w:before="20" w:after="20"/>
+            </w:pPr>
+            <w:r>
+              <w:t xml:space="preserve">Accord sujet-verbe dans les cas simples</w:t>
+            </w:r>
+          </w:p>
+        </w:tc>
+        <w:tc>
+          <w:tcPr>
+            <w:tcW w:type="dxa" w:w="3224"/>
+          </w:tcPr>
+          <w:p>
+            <w:pPr>
+              <w:spacing w:before="20" w:after="20"/>
+            </w:pPr>
+            <w:r>
+              <w:t xml:space="preserve">Sujet loin du verbe ou après ; 2e groupe</w:t>
+            </w:r>
+          </w:p>
+        </w:tc>
+        <w:tc>
+          <w:tcPr>
+            <w:tcW w:type="dxa" w:w="930"/>
+          </w:tcPr>
+          <w:p>
+            <w:pPr>
+              <w:spacing w:before="20" w:after="20"/>
+            </w:pPr>
+            <w:r>
+              <w:t xml:space="preserve">P3</w:t>
+            </w:r>
+          </w:p>
+        </w:tc>
+      </w:tr>
+      <w:tr>
+        <w:tc>
+          <w:tcPr>
+            <w:tcW w:type="dxa" w:w="623"/>
+          </w:tcPr>
+          <w:p>
+            <w:pPr>
+              <w:spacing w:before="20" w:after="20"/>
+            </w:pPr>
+            <w:r>
+              <w:t xml:space="preserve">G6</w:t>
+            </w:r>
+          </w:p>
+        </w:tc>
+        <w:tc>
+          <w:tcPr>
+            <w:tcW w:type="dxa" w:w="982"/>
+          </w:tcPr>
+          <w:p>
+            <w:pPr>
+              <w:spacing w:before="20" w:after="20"/>
+            </w:pPr>
+            <w:r>
+              <w:t xml:space="preserve">Bleue</w:t>
+            </w:r>
+          </w:p>
+        </w:tc>
+        <w:tc>
+          <w:tcPr>
+            <w:tcW w:type="dxa" w:w="3838"/>
+          </w:tcPr>
+          <w:p>
+            <w:pPr>
+              <w:spacing w:before="20" w:after="20"/>
+            </w:pPr>
+            <w:r>
+              <w:t xml:space="preserve">Groupe sujet et groupe verbal ; déplacer, supprimer, ajouter, remplacer</w:t>
+            </w:r>
+          </w:p>
+        </w:tc>
+        <w:tc>
+          <w:tcPr>
+            <w:tcW w:type="dxa" w:w="3224"/>
+          </w:tcPr>
+          <w:p>
+            <w:pPr>
+              <w:spacing w:before="20" w:after="20"/>
+            </w:pPr>
+            <w:r>
+              <w:t xml:space="preserve">COD, COI, compléments circonstanciels</w:t>
+            </w:r>
+          </w:p>
+        </w:tc>
+        <w:tc>
+          <w:tcPr>
+            <w:tcW w:type="dxa" w:w="930"/>
+          </w:tcPr>
+          <w:p>
+            <w:pPr>
+              <w:spacing w:before="20" w:after="20"/>
+            </w:pPr>
+            <w:r>
+              <w:t xml:space="preserve">P3</w:t>
+            </w:r>
+          </w:p>
+        </w:tc>
+      </w:tr>
+      <w:tr>
+        <w:tc>
+          <w:tcPr>
+            <w:tcW w:type="dxa" w:w="623"/>
+          </w:tcPr>
+          <w:p>
+            <w:pPr>
+              <w:spacing w:before="20" w:after="20"/>
+            </w:pPr>
+            <w:r>
+              <w:t xml:space="preserve">G7</w:t>
+            </w:r>
+          </w:p>
+        </w:tc>
+        <w:tc>
+          <w:tcPr>
+            <w:tcW w:type="dxa" w:w="982"/>
+          </w:tcPr>
+          <w:p>
+            <w:pPr>
+              <w:spacing w:before="20" w:after="20"/>
+            </w:pPr>
+            <w:r>
+              <w:t xml:space="preserve">Violette</w:t>
+            </w:r>
+          </w:p>
+        </w:tc>
+        <w:tc>
+          <w:tcPr>
+            <w:tcW w:type="dxa" w:w="3838"/>
+          </w:tcPr>
+          <w:p>
+            <w:pPr>
+              <w:spacing w:before="20" w:after="20"/>
+            </w:pPr>
+            <w:r>
+              <w:t xml:space="preserve">Chaîne des accords : groupe nominal et sujet-verbe</w:t>
+            </w:r>
+          </w:p>
+        </w:tc>
+        <w:tc>
+          <w:tcPr>
+            <w:tcW w:type="dxa" w:w="3224"/>
+          </w:tcPr>
+          <w:p>
+            <w:pPr>
+              <w:spacing w:before="20" w:after="20"/>
+            </w:pPr>
+            <w:r>
+              <w:t xml:space="preserve">Participe passé avec être</w:t>
+            </w:r>
+          </w:p>
+        </w:tc>
+        <w:tc>
+          <w:tcPr>
+            <w:tcW w:type="dxa" w:w="930"/>
+          </w:tcPr>
+          <w:p>
+            <w:pPr>
+              <w:spacing w:before="20" w:after="20"/>
+            </w:pPr>
+            <w:r>
+              <w:t xml:space="preserve">P4</w:t>
+            </w:r>
+          </w:p>
+        </w:tc>
+      </w:tr>
+    </w:tbl>
+    <w:p/>
+    <w:p>
+      <w:pPr>
+        <w:pStyle w:val="BodyText"/>
+      </w:pPr>
+      <w:r>
+        <w:t xml:space="preserve">Programme du cycle 2 (CE2) couvert : phrase simple (groupe sujet, verbe, compléments sans les distinguer), types et formes, classes de mots dont le nom propre et l’adverbe, ponctuation et discours rapporté, accords dans le groupe nominal (-x, -al/-aux, féminins qui s’entendent), relation sujet-verbe. Les compléments circonstanciels sont réservés au cycle 3 : la version CE2 de G6 ne les nomme pas.</w:t>
       </w:r>
     </w:p>
     <w:sectPr>

</xml_diff>

<commit_message>
Adéquation aux programmes : CM1 (articles, nature/fonction, encadrement, polysémie, compléments circonstanciels non classés), CM2 (pronoms compléments) ; homophones retirés du CE2
Co-Authored-By: Claude Opus 5.5 <noreply@anthropic.com>
Claude-Session: https://claude.ai/code/session_017QuRdkcjT4oVgGuiybp2K2
</commit_message>
<xml_diff>
--- a/Documents explicatifs des dispositifs/Dispositif1_Grammaire_CM1_avec_jeux.docx
+++ b/Documents explicatifs des dispositifs/Dispositif1_Grammaire_CM1_avec_jeux.docx
@@ -2247,11 +2247,11 @@
         </w:tblCellMar>
       </w:tblPr>
       <w:tblGrid>
-        <w:gridCol w:w="615"/>
-        <w:gridCol w:w="969"/>
-        <w:gridCol w:w="3080"/>
-        <w:gridCol w:w="4016"/>
-        <w:gridCol w:w="918"/>
+        <w:gridCol w:w="505"/>
+        <w:gridCol w:w="797"/>
+        <w:gridCol w:w="3377"/>
+        <w:gridCol w:w="4163"/>
+        <w:gridCol w:w="755"/>
       </w:tblGrid>
       <w:tr>
         <w:trPr>
@@ -2259,7 +2259,7 @@
         </w:trPr>
         <w:tc>
           <w:tcPr>
-            <w:tcW w:type="dxa" w:w="615"/>
+            <w:tcW w:type="dxa" w:w="505"/>
             <w:shd w:fill="D9E2F3" w:val="clear"/>
           </w:tcPr>
           <w:p>
@@ -2277,7 +2277,7 @@
         </w:tc>
         <w:tc>
           <w:tcPr>
-            <w:tcW w:type="dxa" w:w="969"/>
+            <w:tcW w:type="dxa" w:w="797"/>
             <w:shd w:fill="D9E2F3" w:val="clear"/>
           </w:tcPr>
           <w:p>
@@ -2295,7 +2295,7 @@
         </w:tc>
         <w:tc>
           <w:tcPr>
-            <w:tcW w:type="dxa" w:w="3080"/>
+            <w:tcW w:type="dxa" w:w="3377"/>
             <w:shd w:fill="D9E2F3" w:val="clear"/>
           </w:tcPr>
           <w:p>
@@ -2313,7 +2313,7 @@
         </w:tc>
         <w:tc>
           <w:tcPr>
-            <w:tcW w:type="dxa" w:w="4016"/>
+            <w:tcW w:type="dxa" w:w="4163"/>
             <w:shd w:fill="D9E2F3" w:val="clear"/>
           </w:tcPr>
           <w:p>
@@ -2331,7 +2331,7 @@
         </w:tc>
         <w:tc>
           <w:tcPr>
-            <w:tcW w:type="dxa" w:w="918"/>
+            <w:tcW w:type="dxa" w:w="755"/>
             <w:shd w:fill="D9E2F3" w:val="clear"/>
           </w:tcPr>
           <w:p>
@@ -2351,7 +2351,7 @@
       <w:tr>
         <w:tc>
           <w:tcPr>
-            <w:tcW w:type="dxa" w:w="615"/>
+            <w:tcW w:type="dxa" w:w="505"/>
           </w:tcPr>
           <w:p>
             <w:pPr>
@@ -2364,7 +2364,7 @@
         </w:tc>
         <w:tc>
           <w:tcPr>
-            <w:tcW w:type="dxa" w:w="969"/>
+            <w:tcW w:type="dxa" w:w="797"/>
           </w:tcPr>
           <w:p>
             <w:pPr>
@@ -2377,20 +2377,20 @@
         </w:tc>
         <w:tc>
           <w:tcPr>
-            <w:tcW w:type="dxa" w:w="3080"/>
-          </w:tcPr>
-          <w:p>
-            <w:pPr>
-              <w:spacing w:before="20" w:after="20"/>
-            </w:pPr>
-            <w:r>
-              <w:t xml:space="preserve">Sujet et verbe ; sujet composé, après le verbe ; verbes d’état</w:t>
-            </w:r>
-          </w:p>
-        </w:tc>
-        <w:tc>
-          <w:tcPr>
-            <w:tcW w:type="dxa" w:w="4016"/>
+            <w:tcW w:type="dxa" w:w="3377"/>
+          </w:tcPr>
+          <w:p>
+            <w:pPr>
+              <w:spacing w:before="20" w:after="20"/>
+            </w:pPr>
+            <w:r>
+              <w:t xml:space="preserve">Sujet et verbe ; sujet composé, après le verbe ; verbes d’état ; encadrement « c’est… qui »</w:t>
+            </w:r>
+          </w:p>
+        </w:tc>
+        <w:tc>
+          <w:tcPr>
+            <w:tcW w:type="dxa" w:w="4163"/>
           </w:tcPr>
           <w:p>
             <w:pPr>
@@ -2403,7 +2403,7 @@
         </w:tc>
         <w:tc>
           <w:tcPr>
-            <w:tcW w:type="dxa" w:w="918"/>
+            <w:tcW w:type="dxa" w:w="755"/>
           </w:tcPr>
           <w:p>
             <w:pPr>
@@ -2418,7 +2418,7 @@
       <w:tr>
         <w:tc>
           <w:tcPr>
-            <w:tcW w:type="dxa" w:w="615"/>
+            <w:tcW w:type="dxa" w:w="505"/>
           </w:tcPr>
           <w:p>
             <w:pPr>
@@ -2431,7 +2431,7 @@
         </w:tc>
         <w:tc>
           <w:tcPr>
-            <w:tcW w:type="dxa" w:w="969"/>
+            <w:tcW w:type="dxa" w:w="797"/>
           </w:tcPr>
           <w:p>
             <w:pPr>
@@ -2444,7 +2444,7 @@
         </w:tc>
         <w:tc>
           <w:tcPr>
-            <w:tcW w:type="dxa" w:w="3080"/>
+            <w:tcW w:type="dxa" w:w="3377"/>
           </w:tcPr>
           <w:p>
             <w:pPr>
@@ -2457,7 +2457,7 @@
         </w:tc>
         <w:tc>
           <w:tcPr>
-            <w:tcW w:type="dxa" w:w="4016"/>
+            <w:tcW w:type="dxa" w:w="4163"/>
           </w:tcPr>
           <w:p>
             <w:pPr>
@@ -2470,7 +2470,7 @@
         </w:tc>
         <w:tc>
           <w:tcPr>
-            <w:tcW w:type="dxa" w:w="918"/>
+            <w:tcW w:type="dxa" w:w="755"/>
           </w:tcPr>
           <w:p>
             <w:pPr>
@@ -2485,7 +2485,7 @@
       <w:tr>
         <w:tc>
           <w:tcPr>
-            <w:tcW w:type="dxa" w:w="615"/>
+            <w:tcW w:type="dxa" w:w="505"/>
           </w:tcPr>
           <w:p>
             <w:pPr>
@@ -2498,7 +2498,7 @@
         </w:tc>
         <w:tc>
           <w:tcPr>
-            <w:tcW w:type="dxa" w:w="969"/>
+            <w:tcW w:type="dxa" w:w="797"/>
           </w:tcPr>
           <w:p>
             <w:pPr>
@@ -2511,7 +2511,7 @@
         </w:tc>
         <w:tc>
           <w:tcPr>
-            <w:tcW w:type="dxa" w:w="3080"/>
+            <w:tcW w:type="dxa" w:w="3377"/>
           </w:tcPr>
           <w:p>
             <w:pPr>
@@ -2524,7 +2524,7 @@
         </w:tc>
         <w:tc>
           <w:tcPr>
-            <w:tcW w:type="dxa" w:w="4016"/>
+            <w:tcW w:type="dxa" w:w="4163"/>
           </w:tcPr>
           <w:p>
             <w:pPr>
@@ -2537,7 +2537,7 @@
         </w:tc>
         <w:tc>
           <w:tcPr>
-            <w:tcW w:type="dxa" w:w="918"/>
+            <w:tcW w:type="dxa" w:w="755"/>
           </w:tcPr>
           <w:p>
             <w:pPr>
@@ -2552,7 +2552,7 @@
       <w:tr>
         <w:tc>
           <w:tcPr>
-            <w:tcW w:type="dxa" w:w="615"/>
+            <w:tcW w:type="dxa" w:w="505"/>
           </w:tcPr>
           <w:p>
             <w:pPr>
@@ -2565,7 +2565,7 @@
         </w:tc>
         <w:tc>
           <w:tcPr>
-            <w:tcW w:type="dxa" w:w="969"/>
+            <w:tcW w:type="dxa" w:w="797"/>
           </w:tcPr>
           <w:p>
             <w:pPr>
@@ -2578,33 +2578,33 @@
         </w:tc>
         <w:tc>
           <w:tcPr>
-            <w:tcW w:type="dxa" w:w="3080"/>
-          </w:tcPr>
-          <w:p>
-            <w:pPr>
-              <w:spacing w:before="20" w:after="20"/>
-            </w:pPr>
-            <w:r>
-              <w:t xml:space="preserve">Classes de mots ; verbe ou nom ; variable ou invariable</w:t>
-            </w:r>
-          </w:p>
-        </w:tc>
-        <w:tc>
-          <w:tcPr>
-            <w:tcW w:type="dxa" w:w="4016"/>
-          </w:tcPr>
-          <w:p>
-            <w:pPr>
-              <w:spacing w:before="20" w:after="20"/>
-            </w:pPr>
-            <w:r>
-              <w:t xml:space="preserve">Les prépositions ; les conjonctions de subordination ; le, la, les : déterminant ou pronom</w:t>
-            </w:r>
-          </w:p>
-        </w:tc>
-        <w:tc>
-          <w:tcPr>
-            <w:tcW w:type="dxa" w:w="918"/>
+            <w:tcW w:type="dxa" w:w="3377"/>
+          </w:tcPr>
+          <w:p>
+            <w:pPr>
+              <w:spacing w:before="20" w:after="20"/>
+            </w:pPr>
+            <w:r>
+              <w:t xml:space="preserve">Classes de mots (articles définis et indéfinis compris) ; nature et fonction ; verbe ou nom ; variable ou invariable</w:t>
+            </w:r>
+          </w:p>
+        </w:tc>
+        <w:tc>
+          <w:tcPr>
+            <w:tcW w:type="dxa" w:w="4163"/>
+          </w:tcPr>
+          <w:p>
+            <w:pPr>
+              <w:spacing w:before="20" w:after="20"/>
+            </w:pPr>
+            <w:r>
+              <w:t xml:space="preserve">Les prépositions ; les conjonctions de subordination ; le, la, les : déterminant ou pronom ; les pronoms compléments (me, te, le, la, lui, nous, vous, les, leur)</w:t>
+            </w:r>
+          </w:p>
+        </w:tc>
+        <w:tc>
+          <w:tcPr>
+            <w:tcW w:type="dxa" w:w="755"/>
           </w:tcPr>
           <w:p>
             <w:pPr>
@@ -2619,7 +2619,7 @@
       <w:tr>
         <w:tc>
           <w:tcPr>
-            <w:tcW w:type="dxa" w:w="615"/>
+            <w:tcW w:type="dxa" w:w="505"/>
           </w:tcPr>
           <w:p>
             <w:pPr>
@@ -2632,7 +2632,7 @@
         </w:tc>
         <w:tc>
           <w:tcPr>
-            <w:tcW w:type="dxa" w:w="969"/>
+            <w:tcW w:type="dxa" w:w="797"/>
           </w:tcPr>
           <w:p>
             <w:pPr>
@@ -2645,7 +2645,7 @@
         </w:tc>
         <w:tc>
           <w:tcPr>
-            <w:tcW w:type="dxa" w:w="3080"/>
+            <w:tcW w:type="dxa" w:w="3377"/>
           </w:tcPr>
           <w:p>
             <w:pPr>
@@ -2658,7 +2658,7 @@
         </w:tc>
         <w:tc>
           <w:tcPr>
-            <w:tcW w:type="dxa" w:w="4016"/>
+            <w:tcW w:type="dxa" w:w="4163"/>
           </w:tcPr>
           <w:p>
             <w:pPr>
@@ -2671,7 +2671,7 @@
         </w:tc>
         <w:tc>
           <w:tcPr>
-            <w:tcW w:type="dxa" w:w="918"/>
+            <w:tcW w:type="dxa" w:w="755"/>
           </w:tcPr>
           <w:p>
             <w:pPr>
@@ -2686,7 +2686,7 @@
       <w:tr>
         <w:tc>
           <w:tcPr>
-            <w:tcW w:type="dxa" w:w="615"/>
+            <w:tcW w:type="dxa" w:w="505"/>
           </w:tcPr>
           <w:p>
             <w:pPr>
@@ -2699,7 +2699,7 @@
         </w:tc>
         <w:tc>
           <w:tcPr>
-            <w:tcW w:type="dxa" w:w="969"/>
+            <w:tcW w:type="dxa" w:w="797"/>
           </w:tcPr>
           <w:p>
             <w:pPr>
@@ -2712,20 +2712,20 @@
         </w:tc>
         <w:tc>
           <w:tcPr>
-            <w:tcW w:type="dxa" w:w="3080"/>
-          </w:tcPr>
-          <w:p>
-            <w:pPr>
-              <w:spacing w:before="20" w:after="20"/>
-            </w:pPr>
-            <w:r>
-              <w:t xml:space="preserve">Compléments d’objet et circonstanciels ; supprimer, déplacer</w:t>
-            </w:r>
-          </w:p>
-        </w:tc>
-        <w:tc>
-          <w:tcPr>
-            <w:tcW w:type="dxa" w:w="4016"/>
+            <w:tcW w:type="dxa" w:w="3377"/>
+          </w:tcPr>
+          <w:p>
+            <w:pPr>
+              <w:spacing w:before="20" w:after="20"/>
+            </w:pPr>
+            <w:r>
+              <w:t xml:space="preserve">Compléments d’objet ; compléments circonstanciels repérés sans les classer ; supprimer, déplacer</w:t>
+            </w:r>
+          </w:p>
+        </w:tc>
+        <w:tc>
+          <w:tcPr>
+            <w:tcW w:type="dxa" w:w="4163"/>
           </w:tcPr>
           <w:p>
             <w:pPr>
@@ -2738,7 +2738,7 @@
         </w:tc>
         <w:tc>
           <w:tcPr>
-            <w:tcW w:type="dxa" w:w="918"/>
+            <w:tcW w:type="dxa" w:w="755"/>
           </w:tcPr>
           <w:p>
             <w:pPr>
@@ -2753,7 +2753,7 @@
       <w:tr>
         <w:tc>
           <w:tcPr>
-            <w:tcW w:type="dxa" w:w="615"/>
+            <w:tcW w:type="dxa" w:w="505"/>
           </w:tcPr>
           <w:p>
             <w:pPr>
@@ -2766,7 +2766,7 @@
         </w:tc>
         <w:tc>
           <w:tcPr>
-            <w:tcW w:type="dxa" w:w="969"/>
+            <w:tcW w:type="dxa" w:w="797"/>
           </w:tcPr>
           <w:p>
             <w:pPr>
@@ -2779,7 +2779,7 @@
         </w:tc>
         <w:tc>
           <w:tcPr>
-            <w:tcW w:type="dxa" w:w="3080"/>
+            <w:tcW w:type="dxa" w:w="3377"/>
           </w:tcPr>
           <w:p>
             <w:pPr>
@@ -2792,7 +2792,7 @@
         </w:tc>
         <w:tc>
           <w:tcPr>
-            <w:tcW w:type="dxa" w:w="4016"/>
+            <w:tcW w:type="dxa" w:w="4163"/>
           </w:tcPr>
           <w:p>
             <w:pPr>
@@ -2805,7 +2805,7 @@
         </w:tc>
         <w:tc>
           <w:tcPr>
-            <w:tcW w:type="dxa" w:w="918"/>
+            <w:tcW w:type="dxa" w:w="755"/>
           </w:tcPr>
           <w:p>
             <w:pPr>
@@ -2940,11 +2940,11 @@
         </w:tblCellMar>
       </w:tblPr>
       <w:tblGrid>
-        <w:gridCol w:w="623"/>
-        <w:gridCol w:w="982"/>
-        <w:gridCol w:w="3838"/>
-        <w:gridCol w:w="3224"/>
-        <w:gridCol w:w="930"/>
+        <w:gridCol w:w="591"/>
+        <w:gridCol w:w="932"/>
+        <w:gridCol w:w="3641"/>
+        <w:gridCol w:w="3551"/>
+        <w:gridCol w:w="883"/>
       </w:tblGrid>
       <w:tr>
         <w:trPr>
@@ -2952,7 +2952,7 @@
         </w:trPr>
         <w:tc>
           <w:tcPr>
-            <w:tcW w:type="dxa" w:w="623"/>
+            <w:tcW w:type="dxa" w:w="591"/>
             <w:shd w:fill="D9E2F3" w:val="clear"/>
           </w:tcPr>
           <w:p>
@@ -2970,7 +2970,7 @@
         </w:tc>
         <w:tc>
           <w:tcPr>
-            <w:tcW w:type="dxa" w:w="982"/>
+            <w:tcW w:type="dxa" w:w="932"/>
             <w:shd w:fill="D9E2F3" w:val="clear"/>
           </w:tcPr>
           <w:p>
@@ -2988,7 +2988,7 @@
         </w:tc>
         <w:tc>
           <w:tcPr>
-            <w:tcW w:type="dxa" w:w="3838"/>
+            <w:tcW w:type="dxa" w:w="3641"/>
             <w:shd w:fill="D9E2F3" w:val="clear"/>
           </w:tcPr>
           <w:p>
@@ -3006,7 +3006,7 @@
         </w:tc>
         <w:tc>
           <w:tcPr>
-            <w:tcW w:type="dxa" w:w="3224"/>
+            <w:tcW w:type="dxa" w:w="3551"/>
             <w:shd w:fill="D9E2F3" w:val="clear"/>
           </w:tcPr>
           <w:p>
@@ -3024,7 +3024,7 @@
         </w:tc>
         <w:tc>
           <w:tcPr>
-            <w:tcW w:type="dxa" w:w="930"/>
+            <w:tcW w:type="dxa" w:w="883"/>
             <w:shd w:fill="D9E2F3" w:val="clear"/>
           </w:tcPr>
           <w:p>
@@ -3044,7 +3044,7 @@
       <w:tr>
         <w:tc>
           <w:tcPr>
-            <w:tcW w:type="dxa" w:w="623"/>
+            <w:tcW w:type="dxa" w:w="591"/>
           </w:tcPr>
           <w:p>
             <w:pPr>
@@ -3057,7 +3057,7 @@
         </w:tc>
         <w:tc>
           <w:tcPr>
-            <w:tcW w:type="dxa" w:w="982"/>
+            <w:tcW w:type="dxa" w:w="932"/>
           </w:tcPr>
           <w:p>
             <w:pPr>
@@ -3070,7 +3070,7 @@
         </w:tc>
         <w:tc>
           <w:tcPr>
-            <w:tcW w:type="dxa" w:w="3838"/>
+            <w:tcW w:type="dxa" w:w="3641"/>
           </w:tcPr>
           <w:p>
             <w:pPr>
@@ -3083,20 +3083,20 @@
         </w:tc>
         <w:tc>
           <w:tcPr>
-            <w:tcW w:type="dxa" w:w="3224"/>
-          </w:tcPr>
-          <w:p>
-            <w:pPr>
-              <w:spacing w:before="20" w:after="20"/>
-            </w:pPr>
-            <w:r>
-              <w:t xml:space="preserve">Sujet composé, sujet après le verbe, verbes d’état</w:t>
-            </w:r>
-          </w:p>
-        </w:tc>
-        <w:tc>
-          <w:tcPr>
-            <w:tcW w:type="dxa" w:w="930"/>
+            <w:tcW w:type="dxa" w:w="3551"/>
+          </w:tcPr>
+          <w:p>
+            <w:pPr>
+              <w:spacing w:before="20" w:after="20"/>
+            </w:pPr>
+            <w:r>
+              <w:t xml:space="preserve">Sujet composé, sujet après le verbe, verbes d’état ; encadrement « c’est… qui »</w:t>
+            </w:r>
+          </w:p>
+        </w:tc>
+        <w:tc>
+          <w:tcPr>
+            <w:tcW w:type="dxa" w:w="883"/>
           </w:tcPr>
           <w:p>
             <w:pPr>
@@ -3111,7 +3111,7 @@
       <w:tr>
         <w:tc>
           <w:tcPr>
-            <w:tcW w:type="dxa" w:w="623"/>
+            <w:tcW w:type="dxa" w:w="591"/>
           </w:tcPr>
           <w:p>
             <w:pPr>
@@ -3124,7 +3124,7 @@
         </w:tc>
         <w:tc>
           <w:tcPr>
-            <w:tcW w:type="dxa" w:w="982"/>
+            <w:tcW w:type="dxa" w:w="932"/>
           </w:tcPr>
           <w:p>
             <w:pPr>
@@ -3137,7 +3137,7 @@
         </w:tc>
         <w:tc>
           <w:tcPr>
-            <w:tcW w:type="dxa" w:w="3838"/>
+            <w:tcW w:type="dxa" w:w="3641"/>
           </w:tcPr>
           <w:p>
             <w:pPr>
@@ -3150,7 +3150,7 @@
         </w:tc>
         <w:tc>
           <w:tcPr>
-            <w:tcW w:type="dxa" w:w="3224"/>
+            <w:tcW w:type="dxa" w:w="3551"/>
           </w:tcPr>
           <w:p>
             <w:pPr>
@@ -3163,7 +3163,7 @@
         </w:tc>
         <w:tc>
           <w:tcPr>
-            <w:tcW w:type="dxa" w:w="930"/>
+            <w:tcW w:type="dxa" w:w="883"/>
           </w:tcPr>
           <w:p>
             <w:pPr>
@@ -3178,7 +3178,7 @@
       <w:tr>
         <w:tc>
           <w:tcPr>
-            <w:tcW w:type="dxa" w:w="623"/>
+            <w:tcW w:type="dxa" w:w="591"/>
           </w:tcPr>
           <w:p>
             <w:pPr>
@@ -3191,7 +3191,7 @@
         </w:tc>
         <w:tc>
           <w:tcPr>
-            <w:tcW w:type="dxa" w:w="982"/>
+            <w:tcW w:type="dxa" w:w="932"/>
           </w:tcPr>
           <w:p>
             <w:pPr>
@@ -3204,7 +3204,7 @@
         </w:tc>
         <w:tc>
           <w:tcPr>
-            <w:tcW w:type="dxa" w:w="3838"/>
+            <w:tcW w:type="dxa" w:w="3641"/>
           </w:tcPr>
           <w:p>
             <w:pPr>
@@ -3217,7 +3217,7 @@
         </w:tc>
         <w:tc>
           <w:tcPr>
-            <w:tcW w:type="dxa" w:w="3224"/>
+            <w:tcW w:type="dxa" w:w="3551"/>
           </w:tcPr>
           <w:p>
             <w:pPr>
@@ -3230,7 +3230,7 @@
         </w:tc>
         <w:tc>
           <w:tcPr>
-            <w:tcW w:type="dxa" w:w="930"/>
+            <w:tcW w:type="dxa" w:w="883"/>
           </w:tcPr>
           <w:p>
             <w:pPr>
@@ -3245,7 +3245,7 @@
       <w:tr>
         <w:tc>
           <w:tcPr>
-            <w:tcW w:type="dxa" w:w="623"/>
+            <w:tcW w:type="dxa" w:w="591"/>
           </w:tcPr>
           <w:p>
             <w:pPr>
@@ -3258,7 +3258,7 @@
         </w:tc>
         <w:tc>
           <w:tcPr>
-            <w:tcW w:type="dxa" w:w="982"/>
+            <w:tcW w:type="dxa" w:w="932"/>
           </w:tcPr>
           <w:p>
             <w:pPr>
@@ -3271,7 +3271,7 @@
         </w:tc>
         <w:tc>
           <w:tcPr>
-            <w:tcW w:type="dxa" w:w="3838"/>
+            <w:tcW w:type="dxa" w:w="3641"/>
           </w:tcPr>
           <w:p>
             <w:pPr>
@@ -3284,20 +3284,20 @@
         </w:tc>
         <w:tc>
           <w:tcPr>
-            <w:tcW w:type="dxa" w:w="3224"/>
-          </w:tcPr>
-          <w:p>
-            <w:pPr>
-              <w:spacing w:before="20" w:after="20"/>
-            </w:pPr>
-            <w:r>
-              <w:t xml:space="preserve">Possessifs et démonstratifs, pronoms compléments, conjonctions ; verbe ou nom</w:t>
-            </w:r>
-          </w:p>
-        </w:tc>
-        <w:tc>
-          <w:tcPr>
-            <w:tcW w:type="dxa" w:w="930"/>
+            <w:tcW w:type="dxa" w:w="3551"/>
+          </w:tcPr>
+          <w:p>
+            <w:pPr>
+              <w:spacing w:before="20" w:after="20"/>
+            </w:pPr>
+            <w:r>
+              <w:t xml:space="preserve">Possessifs et démonstratifs, pronoms compléments, conjonctions ; nature et fonction ; verbe ou nom</w:t>
+            </w:r>
+          </w:p>
+        </w:tc>
+        <w:tc>
+          <w:tcPr>
+            <w:tcW w:type="dxa" w:w="883"/>
           </w:tcPr>
           <w:p>
             <w:pPr>
@@ -3312,7 +3312,7 @@
       <w:tr>
         <w:tc>
           <w:tcPr>
-            <w:tcW w:type="dxa" w:w="623"/>
+            <w:tcW w:type="dxa" w:w="591"/>
           </w:tcPr>
           <w:p>
             <w:pPr>
@@ -3325,7 +3325,7 @@
         </w:tc>
         <w:tc>
           <w:tcPr>
-            <w:tcW w:type="dxa" w:w="982"/>
+            <w:tcW w:type="dxa" w:w="932"/>
           </w:tcPr>
           <w:p>
             <w:pPr>
@@ -3338,7 +3338,7 @@
         </w:tc>
         <w:tc>
           <w:tcPr>
-            <w:tcW w:type="dxa" w:w="3838"/>
+            <w:tcW w:type="dxa" w:w="3641"/>
           </w:tcPr>
           <w:p>
             <w:pPr>
@@ -3351,7 +3351,7 @@
         </w:tc>
         <w:tc>
           <w:tcPr>
-            <w:tcW w:type="dxa" w:w="3224"/>
+            <w:tcW w:type="dxa" w:w="3551"/>
           </w:tcPr>
           <w:p>
             <w:pPr>
@@ -3364,7 +3364,7 @@
         </w:tc>
         <w:tc>
           <w:tcPr>
-            <w:tcW w:type="dxa" w:w="930"/>
+            <w:tcW w:type="dxa" w:w="883"/>
           </w:tcPr>
           <w:p>
             <w:pPr>
@@ -3379,7 +3379,7 @@
       <w:tr>
         <w:tc>
           <w:tcPr>
-            <w:tcW w:type="dxa" w:w="623"/>
+            <w:tcW w:type="dxa" w:w="591"/>
           </w:tcPr>
           <w:p>
             <w:pPr>
@@ -3392,7 +3392,7 @@
         </w:tc>
         <w:tc>
           <w:tcPr>
-            <w:tcW w:type="dxa" w:w="982"/>
+            <w:tcW w:type="dxa" w:w="932"/>
           </w:tcPr>
           <w:p>
             <w:pPr>
@@ -3405,7 +3405,7 @@
         </w:tc>
         <w:tc>
           <w:tcPr>
-            <w:tcW w:type="dxa" w:w="3838"/>
+            <w:tcW w:type="dxa" w:w="3641"/>
           </w:tcPr>
           <w:p>
             <w:pPr>
@@ -3418,20 +3418,20 @@
         </w:tc>
         <w:tc>
           <w:tcPr>
-            <w:tcW w:type="dxa" w:w="3224"/>
-          </w:tcPr>
-          <w:p>
-            <w:pPr>
-              <w:spacing w:before="20" w:after="20"/>
-            </w:pPr>
-            <w:r>
-              <w:t xml:space="preserve">COD, COI, compléments circonstanciels</w:t>
-            </w:r>
-          </w:p>
-        </w:tc>
-        <w:tc>
-          <w:tcPr>
-            <w:tcW w:type="dxa" w:w="930"/>
+            <w:tcW w:type="dxa" w:w="3551"/>
+          </w:tcPr>
+          <w:p>
+            <w:pPr>
+              <w:spacing w:before="20" w:after="20"/>
+            </w:pPr>
+            <w:r>
+              <w:t xml:space="preserve">COD, COI ; compléments circonstanciels repérés sans les classer</w:t>
+            </w:r>
+          </w:p>
+        </w:tc>
+        <w:tc>
+          <w:tcPr>
+            <w:tcW w:type="dxa" w:w="883"/>
           </w:tcPr>
           <w:p>
             <w:pPr>
@@ -3446,7 +3446,7 @@
       <w:tr>
         <w:tc>
           <w:tcPr>
-            <w:tcW w:type="dxa" w:w="623"/>
+            <w:tcW w:type="dxa" w:w="591"/>
           </w:tcPr>
           <w:p>
             <w:pPr>
@@ -3459,7 +3459,7 @@
         </w:tc>
         <w:tc>
           <w:tcPr>
-            <w:tcW w:type="dxa" w:w="982"/>
+            <w:tcW w:type="dxa" w:w="932"/>
           </w:tcPr>
           <w:p>
             <w:pPr>
@@ -3472,7 +3472,7 @@
         </w:tc>
         <w:tc>
           <w:tcPr>
-            <w:tcW w:type="dxa" w:w="3838"/>
+            <w:tcW w:type="dxa" w:w="3641"/>
           </w:tcPr>
           <w:p>
             <w:pPr>
@@ -3485,7 +3485,7 @@
         </w:tc>
         <w:tc>
           <w:tcPr>
-            <w:tcW w:type="dxa" w:w="3224"/>
+            <w:tcW w:type="dxa" w:w="3551"/>
           </w:tcPr>
           <w:p>
             <w:pPr>
@@ -3498,7 +3498,7 @@
         </w:tc>
         <w:tc>
           <w:tcPr>
-            <w:tcW w:type="dxa" w:w="930"/>
+            <w:tcW w:type="dxa" w:w="883"/>
           </w:tcPr>
           <w:p>
             <w:pPr>
@@ -3518,6 +3518,102 @@
       </w:pPr>
       <w:r>
         <w:t xml:space="preserve">Programme du cycle 2 (CE2) couvert : phrase simple (groupe sujet, verbe, compléments sans les distinguer), types et formes, classes de mots dont le nom propre et l’adverbe, ponctuation et discours rapporté, accords dans le groupe nominal (-x, -al/-aux, féminins qui s’entendent), relation sujet-verbe. Les compléments circonstanciels sont réservés au cycle 3 : la version CE2 de G6 ne les nomme pas.</w:t>
+      </w:r>
+    </w:p>
+    <w:p>
+      <w:pPr>
+        <w:pStyle w:val="Heading1"/>
+      </w:pPr>
+      <w:r>
+        <w:t xml:space="preserve">Mise à jour d’octobre 2026 : adéquation au programme (CM1)</w:t>
+      </w:r>
+    </w:p>
+    <w:p>
+      <w:pPr>
+        <w:pStyle w:val="BodyText"/>
+      </w:pPr>
+      <w:r>
+        <w:t xml:space="preserve">Après vérification ligne à ligne avec le programme de français du cycle 3 (2025), quatre ajustements du CM1 :</w:t>
+      </w:r>
+    </w:p>
+    <w:p>
+      <w:pPr>
+        <w:pStyle w:val="BodyText"/>
+        <w:numPr>
+          <w:ilvl w:val="0"/>
+          <w:numId w:val="1"/>
+        </w:numPr>
+        <w:spacing w:after="60"/>
+      </w:pPr>
+      <w:r>
+        <w:rPr>
+          <w:b/>
+          <w:bCs/>
+        </w:rPr>
+        <w:t xml:space="preserve">G1</w:t>
+      </w:r>
+      <w:r>
+        <w:t xml:space="preserve"> : ajout de l’encadrement « c’est… qui » parmi les manipulations (le programme du CM1 cite déplacement, suppression, substitution, addition, encadrement).</w:t>
+      </w:r>
+    </w:p>
+    <w:p>
+      <w:pPr>
+        <w:pStyle w:val="BodyText"/>
+        <w:numPr>
+          <w:ilvl w:val="0"/>
+          <w:numId w:val="1"/>
+        </w:numPr>
+        <w:spacing w:after="60"/>
+      </w:pPr>
+      <w:r>
+        <w:rPr>
+          <w:b/>
+          <w:bCs/>
+        </w:rPr>
+        <w:t xml:space="preserve">G4</w:t>
+      </w:r>
+      <w:r>
+        <w:t xml:space="preserve"> : les articles définis (le, la, l’, les) et indéfinis (un, une, des) sont nommés, à côté des possessifs et des démonstratifs.</w:t>
+      </w:r>
+    </w:p>
+    <w:p>
+      <w:pPr>
+        <w:pStyle w:val="BodyText"/>
+        <w:numPr>
+          <w:ilvl w:val="0"/>
+          <w:numId w:val="1"/>
+        </w:numPr>
+        <w:spacing w:after="60"/>
+      </w:pPr>
+      <w:r>
+        <w:rPr>
+          <w:b/>
+          <w:bCs/>
+        </w:rPr>
+        <w:t xml:space="preserve">G4</w:t>
+      </w:r>
+      <w:r>
+        <w:t xml:space="preserve"> : un écran « Nature ou fonction ? » pour se familiariser avec les deux notions (le programme du CM1 : « se familiariser avec les notions de nature et fonction »).</w:t>
+      </w:r>
+    </w:p>
+    <w:p>
+      <w:pPr>
+        <w:pStyle w:val="BodyText"/>
+        <w:numPr>
+          <w:ilvl w:val="0"/>
+          <w:numId w:val="1"/>
+        </w:numPr>
+        <w:spacing w:after="60"/>
+      </w:pPr>
+      <w:r>
+        <w:rPr>
+          <w:b/>
+          <w:bCs/>
+        </w:rPr>
+        <w:t xml:space="preserve">G6</w:t>
+      </w:r>
+      <w:r>
+        <w:t xml:space="preserve"> : les compléments circonstanciels sont repérés avec les questions où ? quand ? comment ?, sans être classés ; leur distinction (temps, lieu, cause) est réservée au CM2.</w:t>
       </w:r>
     </w:p>
     <w:sectPr>

</xml_diff>